<commit_message>
updated doc and ppt
</commit_message>
<xml_diff>
--- a/LegalDocumentSummarizer (Legal Lens).docx
+++ b/LegalDocumentSummarizer (Legal Lens).docx
@@ -679,18 +679,6 @@
     </w:p>
     <w:p>
       <w:pPr>
-        <w:ind w:left="360"/>
-        <w:jc w:val="both"/>
-        <w:rPr>
-          <w:rFonts w:ascii="Times New Roman" w:hAnsi="Times New Roman" w:cs="Times New Roman"/>
-          <w:sz w:val="24"/>
-          <w:szCs w:val="24"/>
-        </w:rPr>
-      </w:pPr>
-    </w:p>
-    <w:p>
-      <w:pPr>
-        <w:ind w:left="360"/>
         <w:jc w:val="both"/>
         <w:rPr>
           <w:rFonts w:ascii="Times New Roman" w:hAnsi="Times New Roman" w:cs="Times New Roman"/>
@@ -735,6 +723,8 @@
       <w:r>
         <w:rPr>
           <w:rFonts w:ascii="Times New Roman" w:hAnsi="Times New Roman" w:cs="Times New Roman"/>
+          <w:b/>
+          <w:bCs/>
           <w:i/>
           <w:iCs/>
           <w:sz w:val="24"/>
@@ -746,6 +736,8 @@
       <w:r>
         <w:rPr>
           <w:rFonts w:ascii="Times New Roman" w:hAnsi="Times New Roman" w:cs="Times New Roman"/>
+          <w:b/>
+          <w:bCs/>
           <w:i/>
           <w:iCs/>
           <w:sz w:val="24"/>
@@ -757,12 +749,40 @@
       <w:r>
         <w:rPr>
           <w:rFonts w:ascii="Times New Roman" w:hAnsi="Times New Roman" w:cs="Times New Roman"/>
+          <w:b/>
+          <w:bCs/>
           <w:i/>
           <w:iCs/>
           <w:sz w:val="24"/>
           <w:szCs w:val="24"/>
         </w:rPr>
-        <w:t xml:space="preserve"> Ltd) : </w:t>
+        <w:t xml:space="preserve"> Ltd</w:t>
+      </w:r>
+      <w:proofErr w:type="gramStart"/>
+      <w:r>
+        <w:rPr>
+          <w:rFonts w:ascii="Times New Roman" w:hAnsi="Times New Roman" w:cs="Times New Roman"/>
+          <w:b/>
+          <w:bCs/>
+          <w:i/>
+          <w:iCs/>
+          <w:sz w:val="24"/>
+          <w:szCs w:val="24"/>
+        </w:rPr>
+        <w:t>) :</w:t>
+      </w:r>
+      <w:proofErr w:type="gramEnd"/>
+      <w:r>
+        <w:rPr>
+          <w:rFonts w:ascii="Times New Roman" w:hAnsi="Times New Roman" w:cs="Times New Roman"/>
+          <w:b/>
+          <w:bCs/>
+          <w:i/>
+          <w:iCs/>
+          <w:sz w:val="24"/>
+          <w:szCs w:val="24"/>
+        </w:rPr>
+        <w:t xml:space="preserve"> </w:t>
       </w:r>
     </w:p>
     <w:p>
@@ -957,7 +977,6 @@
           <w:sz w:val="24"/>
           <w:szCs w:val="24"/>
         </w:rPr>
-        <w:lastRenderedPageBreak/>
         <w:t>End-to-End Case Guidance: Guides clients seamlessly through each phase of the small claims court process.</w:t>
       </w:r>
     </w:p>
@@ -982,6 +1001,7 @@
           <w:sz w:val="24"/>
           <w:szCs w:val="24"/>
         </w:rPr>
+        <w:lastRenderedPageBreak/>
         <w:t xml:space="preserve">Limitations: </w:t>
       </w:r>
     </w:p>
@@ -2682,6 +2702,7 @@
   <w:style w:type="character" w:default="1" w:styleId="DefaultParagraphFont">
     <w:name w:val="Default Paragraph Font"/>
     <w:uiPriority w:val="1"/>
+    <w:semiHidden/>
     <w:unhideWhenUsed/>
   </w:style>
   <w:style w:type="table" w:default="1" w:styleId="TableNormal">

</xml_diff>